<commit_message>
Add reminder of start and end dates if wanted, update metadata
</commit_message>
<xml_diff>
--- a/docassemble/AkPowerOfAttorneyOverAMinorByParentOrGuardian/data/templates/ak_power_of_attorney_over_a_minor_by_parent_or_guardian_next_steps.docx
+++ b/docassemble/AkPowerOfAttorneyOverAMinorByParentOrGuardian/data/templates/ak_power_of_attorney_over_a_minor_by_parent_or_guardian_next_steps.docx
@@ -358,98 +358,21 @@
           <w:rtl w:val="0"/>
           <w:lang w:val="en-US"/>
         </w:rPr>
-        <w:t>Choose when you want</w:t>
-      </w:r>
-      <w:r>
-        <w:rPr>
-          <w:rtl w:val="0"/>
-          <w:lang w:val="en-US"/>
-        </w:rPr>
-        <w:t xml:space="preserve"> {</w:t>
-      </w:r>
-      <w:r>
-        <w:rPr>
-          <w:rtl w:val="0"/>
-          <w:lang w:val="en-US"/>
-        </w:rPr>
-        <w:t>{</w:t>
-      </w:r>
-      <w:r>
-        <w:rPr>
-          <w:rtl w:val="0"/>
-          <w:lang w:val="en-US"/>
-        </w:rPr>
-        <w:t xml:space="preserve"> caregivers[0].name.full() }</w:t>
-      </w:r>
-      <w:r>
-        <w:rPr>
-          <w:rtl w:val="0"/>
-          <w:lang w:val="en-US"/>
-        </w:rPr>
-        <w:t xml:space="preserve">} to start making decisions and when you want them to stop. {{ </w:t>
-      </w:r>
-      <w:r>
-        <w:rPr>
-          <w:rtl w:val="0"/>
-          <w:lang w:val="en-US"/>
-        </w:rPr>
-        <w:t xml:space="preserve">"That time period can be up to 1 year or, if you need, it can be up to 30 days after your </w:t>
-      </w:r>
-      <w:r>
-        <w:rPr>
-          <w:rtl w:val="0"/>
-          <w:lang w:val="en-US"/>
-        </w:rPr>
-        <w:t xml:space="preserve">deployment orders say your military </w:t>
-      </w:r>
-      <w:r>
-        <w:rPr>
-          <w:rtl w:val="0"/>
-          <w:lang w:val="en-US"/>
-        </w:rPr>
-        <w:t xml:space="preserve">duty ends" if users[0].is_in_US_military else </w:t>
-      </w:r>
-      <w:r>
-        <w:rPr>
-          <w:rtl w:val="0"/>
-          <w:lang w:val="en-US"/>
-        </w:rPr>
-        <w:t>“</w:t>
-      </w:r>
-      <w:r>
-        <w:rPr>
-          <w:rtl w:val="0"/>
-          <w:lang w:val="en-US"/>
-        </w:rPr>
-        <w:t>You can give them</w:t>
-      </w:r>
-      <w:r>
-        <w:rPr>
-          <w:rtl w:val="0"/>
-          <w:lang w:val="en-US"/>
-        </w:rPr>
-        <w:t xml:space="preserve"> permission </w:t>
-      </w:r>
-      <w:r>
-        <w:rPr>
-          <w:rtl w:val="0"/>
-          <w:lang w:val="en-US"/>
-        </w:rPr>
-        <w:t xml:space="preserve">for </w:t>
-      </w:r>
-      <w:r>
-        <w:rPr>
-          <w:rtl w:val="0"/>
-          <w:lang w:val="en-US"/>
-        </w:rPr>
-        <w:t>up to a year"</w:t>
-      </w:r>
-      <w:r>
-        <w:rPr>
-          <w:rtl w:val="0"/>
-          <w:lang w:val="en-US"/>
-        </w:rPr>
-        <w:t xml:space="preserve"> }}.</w:t>
+        <w:t xml:space="preserve">{%- if </w:t>
+      </w:r>
+      <w:r>
+        <w:rPr>
+          <w:rtl w:val="0"/>
+          <w:lang w:val="en-US"/>
+        </w:rPr>
+        <w:t>decide_delegation_dates_later</w:t>
+      </w:r>
+      <w:r>
+        <w:rPr>
+          <w:rtl w:val="0"/>
+          <w:lang w:val="en-US"/>
+        </w:rPr>
+        <w:t xml:space="preserve"> %}</w:t>
       </w:r>
     </w:p>
     <w:p>
@@ -472,51 +395,98 @@
           <w:rtl w:val="0"/>
           <w:lang w:val="en-US"/>
         </w:rPr>
-        <w:t>Go to a notary certified in Alaska.</w:t>
-      </w:r>
-      <w:r>
-        <w:rPr>
-          <w:rtl w:val="0"/>
-          <w:lang w:val="en-US"/>
-        </w:rPr>
-        <w:t xml:space="preserve"> To read more about finding a notary, go to </w:t>
-      </w:r>
-      <w:r>
-        <w:rPr>
-          <w:rStyle w:val="Hyperlink.0"/>
-        </w:rPr>
-        <w:fldChar w:fldCharType="begin" w:fldLock="0"/>
-      </w:r>
-      <w:r>
-        <w:rPr>
-          <w:rStyle w:val="Hyperlink.0"/>
-        </w:rPr>
-        <w:instrText xml:space="preserve"> HYPERLINK "https://courtformsonline.org/guides/finding-and-using-a-notary"</w:instrText>
-      </w:r>
-      <w:r>
-        <w:rPr>
-          <w:rStyle w:val="Hyperlink.0"/>
-        </w:rPr>
-        <w:fldChar w:fldCharType="separate" w:fldLock="0"/>
-      </w:r>
-      <w:r>
-        <w:rPr>
-          <w:rStyle w:val="Hyperlink.0"/>
-          <w:rtl w:val="0"/>
-          <w:lang w:val="en-US"/>
-        </w:rPr>
-        <w:t>https://courtformsonline.org/guides/finding-and-using-a-notary</w:t>
-      </w:r>
-      <w:r>
-        <w:rPr/>
-        <w:fldChar w:fldCharType="end" w:fldLock="0"/>
-      </w:r>
-      <w:r>
-        <w:rPr>
-          <w:rtl w:val="0"/>
-          <w:lang w:val="en-US"/>
-        </w:rPr>
-        <w:t>.</w:t>
+        <w:t>Choose when you want</w:t>
+      </w:r>
+      <w:r>
+        <w:rPr>
+          <w:rtl w:val="0"/>
+          <w:lang w:val="en-US"/>
+        </w:rPr>
+        <w:t xml:space="preserve"> {</w:t>
+      </w:r>
+      <w:r>
+        <w:rPr>
+          <w:rtl w:val="0"/>
+          <w:lang w:val="en-US"/>
+        </w:rPr>
+        <w:t>{</w:t>
+      </w:r>
+      <w:r>
+        <w:rPr>
+          <w:rtl w:val="0"/>
+          <w:lang w:val="en-US"/>
+        </w:rPr>
+        <w:t xml:space="preserve"> caregivers[0].name.full() }</w:t>
+      </w:r>
+      <w:r>
+        <w:rPr>
+          <w:rtl w:val="0"/>
+          <w:lang w:val="en-US"/>
+        </w:rPr>
+        <w:t xml:space="preserve">} to start making decisions and when you want them to stop. {{ </w:t>
+      </w:r>
+      <w:r>
+        <w:rPr>
+          <w:rtl w:val="0"/>
+          <w:lang w:val="en-US"/>
+        </w:rPr>
+        <w:t xml:space="preserve">"That time period can be up to 1 year or, if you need, it can be up to 30 days after your </w:t>
+      </w:r>
+      <w:r>
+        <w:rPr>
+          <w:rtl w:val="0"/>
+          <w:lang w:val="en-US"/>
+        </w:rPr>
+        <w:t xml:space="preserve">deployment orders say your military </w:t>
+      </w:r>
+      <w:r>
+        <w:rPr>
+          <w:rtl w:val="0"/>
+          <w:lang w:val="en-US"/>
+        </w:rPr>
+        <w:t xml:space="preserve">duty ends" if users[0].is_in_US_military else </w:t>
+      </w:r>
+      <w:r>
+        <w:rPr>
+          <w:rtl w:val="0"/>
+          <w:lang w:val="en-US"/>
+        </w:rPr>
+        <w:t>“</w:t>
+      </w:r>
+      <w:r>
+        <w:rPr>
+          <w:rtl w:val="0"/>
+          <w:lang w:val="en-US"/>
+        </w:rPr>
+        <w:t>You can give them</w:t>
+      </w:r>
+      <w:r>
+        <w:rPr>
+          <w:rtl w:val="0"/>
+          <w:lang w:val="en-US"/>
+        </w:rPr>
+        <w:t xml:space="preserve"> permission </w:t>
+      </w:r>
+      <w:r>
+        <w:rPr>
+          <w:rtl w:val="0"/>
+          <w:lang w:val="en-US"/>
+        </w:rPr>
+        <w:t xml:space="preserve">for </w:t>
+      </w:r>
+      <w:r>
+        <w:rPr>
+          <w:rtl w:val="0"/>
+          <w:lang w:val="en-US"/>
+        </w:rPr>
+        <w:t>up to a year"</w:t>
+      </w:r>
+      <w:r>
+        <w:rPr>
+          <w:rtl w:val="0"/>
+          <w:lang w:val="en-US"/>
+        </w:rPr>
+        <w:t xml:space="preserve"> }}.</w:t>
       </w:r>
     </w:p>
     <w:p>
@@ -539,7 +509,7 @@
           <w:rtl w:val="0"/>
           <w:lang w:val="en-US"/>
         </w:rPr>
-        <w:t>While the notary is watching, write down the start date and end date on both documents.</w:t>
+        <w:t>{% endif -%}</w:t>
       </w:r>
     </w:p>
     <w:p>
@@ -562,49 +532,7 @@
           <w:rtl w:val="0"/>
           <w:lang w:val="en-US"/>
         </w:rPr>
-        <w:t xml:space="preserve">While the notary is watching, sign those documents and have </w:t>
-      </w:r>
-      <w:r>
-        <w:rPr>
-          <w:rtl w:val="0"/>
-          <w:lang w:val="en-US"/>
-        </w:rPr>
-        <w:t>{</w:t>
-      </w:r>
-      <w:r>
-        <w:rPr>
-          <w:rtl w:val="0"/>
-          <w:lang w:val="en-US"/>
-        </w:rPr>
-        <w:t>{</w:t>
-      </w:r>
-      <w:r>
-        <w:rPr>
-          <w:rtl w:val="0"/>
-          <w:lang w:val="en-US"/>
-        </w:rPr>
-        <w:t xml:space="preserve"> caregivers[0].name.full() }</w:t>
-      </w:r>
-      <w:r>
-        <w:rPr>
-          <w:rtl w:val="0"/>
-          <w:lang w:val="en-US"/>
-        </w:rPr>
-        <w:t>} sign as well. Write that day</w:t>
-      </w:r>
-      <w:r>
-        <w:rPr>
-          <w:rtl w:val="0"/>
-          <w:lang w:val="en-US"/>
-        </w:rPr>
-        <w:t>’</w:t>
-      </w:r>
-      <w:r>
-        <w:rPr>
-          <w:rtl w:val="0"/>
-          <w:lang w:val="en-US"/>
-        </w:rPr>
-        <w:t>s date next to each signature.</w:t>
+        <w:t>Write the start and end dates in the blank spaces.</w:t>
       </w:r>
     </w:p>
     <w:p>
@@ -627,6 +555,429 @@
           <w:rtl w:val="0"/>
           <w:lang w:val="en-US"/>
         </w:rPr>
+        <w:t>Go to a notary certified in Alaska.</w:t>
+      </w:r>
+      <w:r>
+        <w:rPr>
+          <w:rtl w:val="0"/>
+          <w:lang w:val="en-US"/>
+        </w:rPr>
+        <w:t xml:space="preserve"> To read more about finding a notary, go to </w:t>
+      </w:r>
+      <w:r>
+        <w:rPr>
+          <w:rStyle w:val="Hyperlink.0"/>
+        </w:rPr>
+        <w:fldChar w:fldCharType="begin" w:fldLock="0"/>
+      </w:r>
+      <w:r>
+        <w:rPr>
+          <w:rStyle w:val="Hyperlink.0"/>
+        </w:rPr>
+        <w:instrText xml:space="preserve"> HYPERLINK "https://courtformsonline.org/guides/finding-and-using-a-notary"</w:instrText>
+      </w:r>
+      <w:r>
+        <w:rPr>
+          <w:rStyle w:val="Hyperlink.0"/>
+        </w:rPr>
+        <w:fldChar w:fldCharType="separate" w:fldLock="0"/>
+      </w:r>
+      <w:r>
+        <w:rPr>
+          <w:rStyle w:val="Hyperlink.0"/>
+          <w:rtl w:val="0"/>
+          <w:lang w:val="en-US"/>
+        </w:rPr>
+        <w:t>https://courtformsonline.org/guides/finding-and-using-a-notary</w:t>
+      </w:r>
+      <w:r>
+        <w:rPr/>
+        <w:fldChar w:fldCharType="end" w:fldLock="0"/>
+      </w:r>
+      <w:r>
+        <w:rPr>
+          <w:rtl w:val="0"/>
+          <w:lang w:val="en-US"/>
+        </w:rPr>
+        <w:t>.</w:t>
+      </w:r>
+    </w:p>
+    <w:p>
+      <w:pPr>
+        <w:pStyle w:val="List Paragraph"/>
+        <w:numPr>
+          <w:ilvl w:val="0"/>
+          <w:numId w:val="2"/>
+        </w:numPr>
+        <w:bidi w:val="0"/>
+        <w:ind w:right="0"/>
+        <w:jc w:val="left"/>
+        <w:rPr>
+          <w:rtl w:val="0"/>
+          <w:lang w:val="en-US"/>
+        </w:rPr>
+      </w:pPr>
+      <w:r>
+        <w:rPr>
+          <w:rtl w:val="0"/>
+          <w:lang w:val="en-US"/>
+        </w:rPr>
+        <w:t xml:space="preserve">While the notary is watching, write down the start date and end date on the blank spaces on both documents. </w:t>
+      </w:r>
+    </w:p>
+    <w:p>
+      <w:pPr>
+        <w:pStyle w:val="List Paragraph"/>
+        <w:numPr>
+          <w:ilvl w:val="0"/>
+          <w:numId w:val="2"/>
+        </w:numPr>
+        <w:bidi w:val="0"/>
+        <w:ind w:right="0"/>
+        <w:jc w:val="left"/>
+        <w:rPr>
+          <w:rtl w:val="0"/>
+          <w:lang w:val="en-US"/>
+        </w:rPr>
+      </w:pPr>
+      <w:r>
+        <w:rPr>
+          <w:rtl w:val="0"/>
+          <w:lang w:val="en-US"/>
+        </w:rPr>
+        <w:t xml:space="preserve">{%- if </w:t>
+      </w:r>
+      <w:r>
+        <w:rPr>
+          <w:rtl w:val="0"/>
+          <w:lang w:val="en-US"/>
+        </w:rPr>
+        <w:t>defined(</w:t>
+      </w:r>
+      <w:r>
+        <w:rPr>
+          <w:rtl w:val="0"/>
+          <w:lang w:val="en-US"/>
+        </w:rPr>
+        <w:t>“</w:t>
+      </w:r>
+      <w:r>
+        <w:rPr>
+          <w:rtl w:val="0"/>
+          <w:lang w:val="en-US"/>
+        </w:rPr>
+        <w:t>delegation_start_date</w:t>
+      </w:r>
+      <w:r>
+        <w:rPr>
+          <w:rtl w:val="0"/>
+          <w:lang w:val="en-US"/>
+        </w:rPr>
+        <w:t>”</w:t>
+      </w:r>
+      <w:r>
+        <w:rPr>
+          <w:rtl w:val="0"/>
+          <w:lang w:val="en-US"/>
+        </w:rPr>
+        <w:t>)</w:t>
+      </w:r>
+      <w:r>
+        <w:rPr>
+          <w:rtl w:val="0"/>
+          <w:lang w:val="en-US"/>
+        </w:rPr>
+        <w:t xml:space="preserve"> and delegation_start_date</w:t>
+      </w:r>
+      <w:r>
+        <w:rPr>
+          <w:rtl w:val="0"/>
+          <w:lang w:val="en-US"/>
+        </w:rPr>
+        <w:t xml:space="preserve"> </w:t>
+      </w:r>
+      <w:r>
+        <w:rPr>
+          <w:rtl w:val="0"/>
+          <w:lang w:val="en-US"/>
+        </w:rPr>
+        <w:t>-%}</w:t>
+      </w:r>
+    </w:p>
+    <w:p>
+      <w:pPr>
+        <w:pStyle w:val="List Paragraph"/>
+        <w:numPr>
+          <w:ilvl w:val="0"/>
+          <w:numId w:val="2"/>
+        </w:numPr>
+        <w:bidi w:val="0"/>
+        <w:ind w:right="0"/>
+        <w:jc w:val="left"/>
+        <w:rPr>
+          <w:rtl w:val="0"/>
+          <w:lang w:val="en-US"/>
+        </w:rPr>
+      </w:pPr>
+      <w:r>
+        <w:rPr>
+          <w:rtl w:val="0"/>
+          <w:lang w:val="en-US"/>
+        </w:rPr>
+        <w:t xml:space="preserve">You said you wanted permission to </w:t>
+      </w:r>
+      <w:r>
+        <w:rPr>
+          <w:b w:val="1"/>
+          <w:bCs w:val="1"/>
+          <w:rtl w:val="0"/>
+          <w:lang w:val="en-US"/>
+        </w:rPr>
+        <w:t>start on {{ delegation_start_date }}</w:t>
+      </w:r>
+      <w:r>
+        <w:rPr>
+          <w:rtl w:val="0"/>
+          <w:lang w:val="en-US"/>
+        </w:rPr>
+        <w:t xml:space="preserve">. </w:t>
+      </w:r>
+    </w:p>
+    <w:p>
+      <w:pPr>
+        <w:pStyle w:val="List Paragraph"/>
+        <w:numPr>
+          <w:ilvl w:val="0"/>
+          <w:numId w:val="2"/>
+        </w:numPr>
+        <w:bidi w:val="0"/>
+        <w:ind w:right="0"/>
+        <w:jc w:val="left"/>
+        <w:rPr>
+          <w:rtl w:val="0"/>
+          <w:lang w:val="en-US"/>
+        </w:rPr>
+      </w:pPr>
+      <w:r>
+        <w:rPr>
+          <w:rtl w:val="0"/>
+          <w:lang w:val="en-US"/>
+        </w:rPr>
+        <w:t>{%- endif -%}</w:t>
+      </w:r>
+    </w:p>
+    <w:p>
+      <w:pPr>
+        <w:pStyle w:val="List Paragraph"/>
+        <w:numPr>
+          <w:ilvl w:val="0"/>
+          <w:numId w:val="2"/>
+        </w:numPr>
+        <w:bidi w:val="0"/>
+        <w:ind w:right="0"/>
+        <w:jc w:val="left"/>
+        <w:rPr>
+          <w:rtl w:val="0"/>
+          <w:lang w:val="en-US"/>
+        </w:rPr>
+      </w:pPr>
+      <w:r>
+        <w:rPr>
+          <w:rtl w:val="0"/>
+          <w:lang w:val="en-US"/>
+        </w:rPr>
+        <w:t>{%- if defined(</w:t>
+      </w:r>
+      <w:r>
+        <w:rPr>
+          <w:rtl w:val="0"/>
+          <w:lang w:val="en-US"/>
+        </w:rPr>
+        <w:t>“</w:t>
+      </w:r>
+      <w:r>
+        <w:rPr>
+          <w:rtl w:val="0"/>
+          <w:lang w:val="en-US"/>
+        </w:rPr>
+        <w:t>delegation_end_date</w:t>
+      </w:r>
+      <w:r>
+        <w:rPr>
+          <w:rtl w:val="0"/>
+          <w:lang w:val="en-US"/>
+        </w:rPr>
+        <w:t>”</w:t>
+      </w:r>
+      <w:r>
+        <w:rPr>
+          <w:rtl w:val="0"/>
+          <w:lang w:val="en-US"/>
+        </w:rPr>
+        <w:t>)</w:t>
+      </w:r>
+      <w:r>
+        <w:rPr>
+          <w:rtl w:val="0"/>
+          <w:lang w:val="en-US"/>
+        </w:rPr>
+        <w:t xml:space="preserve"> and delegation_end_date</w:t>
+      </w:r>
+      <w:r>
+        <w:rPr>
+          <w:rtl w:val="0"/>
+          <w:lang w:val="en-US"/>
+        </w:rPr>
+        <w:t xml:space="preserve"> -%}</w:t>
+      </w:r>
+    </w:p>
+    <w:p>
+      <w:pPr>
+        <w:pStyle w:val="List Paragraph"/>
+        <w:numPr>
+          <w:ilvl w:val="0"/>
+          <w:numId w:val="2"/>
+        </w:numPr>
+        <w:bidi w:val="0"/>
+        <w:ind w:right="0"/>
+        <w:jc w:val="left"/>
+        <w:rPr>
+          <w:rtl w:val="0"/>
+          <w:lang w:val="en-US"/>
+        </w:rPr>
+      </w:pPr>
+      <w:r>
+        <w:rPr>
+          <w:rtl w:val="0"/>
+          <w:lang w:val="en-US"/>
+        </w:rPr>
+        <w:t xml:space="preserve">You said you wanted permission to </w:t>
+      </w:r>
+      <w:r>
+        <w:rPr>
+          <w:b w:val="1"/>
+          <w:bCs w:val="1"/>
+          <w:rtl w:val="0"/>
+          <w:lang w:val="en-US"/>
+        </w:rPr>
+        <w:t>end on {{ delegation_end_date }}</w:t>
+      </w:r>
+      <w:r>
+        <w:rPr>
+          <w:rtl w:val="0"/>
+          <w:lang w:val="en-US"/>
+        </w:rPr>
+        <w:t>.</w:t>
+      </w:r>
+    </w:p>
+    <w:p>
+      <w:pPr>
+        <w:pStyle w:val="List Paragraph"/>
+        <w:numPr>
+          <w:ilvl w:val="0"/>
+          <w:numId w:val="2"/>
+        </w:numPr>
+        <w:bidi w:val="0"/>
+        <w:ind w:right="0"/>
+        <w:jc w:val="left"/>
+        <w:rPr>
+          <w:rtl w:val="0"/>
+          <w:lang w:val="en-US"/>
+        </w:rPr>
+      </w:pPr>
+      <w:r>
+        <w:rPr>
+          <w:rtl w:val="0"/>
+          <w:lang w:val="en-US"/>
+        </w:rPr>
+        <w:t>{%- endif %}</w:t>
+      </w:r>
+    </w:p>
+    <w:p>
+      <w:pPr>
+        <w:pStyle w:val="List Paragraph"/>
+        <w:numPr>
+          <w:ilvl w:val="0"/>
+          <w:numId w:val="2"/>
+        </w:numPr>
+        <w:bidi w:val="0"/>
+        <w:ind w:right="0"/>
+        <w:jc w:val="left"/>
+        <w:rPr>
+          <w:rtl w:val="0"/>
+          <w:lang w:val="en-US"/>
+        </w:rPr>
+      </w:pPr>
+      <w:r>
+        <w:rPr>
+          <w:rtl w:val="0"/>
+          <w:lang w:val="en-US"/>
+        </w:rPr>
+        <w:t xml:space="preserve">While the notary is watching, sign those documents and have </w:t>
+      </w:r>
+      <w:r>
+        <w:rPr>
+          <w:rtl w:val="0"/>
+          <w:lang w:val="en-US"/>
+        </w:rPr>
+        <w:t>{</w:t>
+      </w:r>
+      <w:r>
+        <w:rPr>
+          <w:rtl w:val="0"/>
+          <w:lang w:val="en-US"/>
+        </w:rPr>
+        <w:t>{</w:t>
+      </w:r>
+      <w:r>
+        <w:rPr>
+          <w:rtl w:val="0"/>
+          <w:lang w:val="en-US"/>
+        </w:rPr>
+        <w:t xml:space="preserve"> caregivers[0].name.full() }</w:t>
+      </w:r>
+      <w:r>
+        <w:rPr>
+          <w:rtl w:val="0"/>
+          <w:lang w:val="en-US"/>
+        </w:rPr>
+        <w:t>} sign as well. Write that day</w:t>
+      </w:r>
+      <w:r>
+        <w:rPr>
+          <w:rtl w:val="0"/>
+          <w:lang w:val="en-US"/>
+        </w:rPr>
+        <w:t>’</w:t>
+      </w:r>
+      <w:r>
+        <w:rPr>
+          <w:rtl w:val="0"/>
+          <w:lang w:val="en-US"/>
+        </w:rPr>
+        <w:t>s date next to each signature.</w:t>
+      </w:r>
+    </w:p>
+    <w:p>
+      <w:pPr>
+        <w:pStyle w:val="List Paragraph"/>
+        <w:numPr>
+          <w:ilvl w:val="0"/>
+          <w:numId w:val="2"/>
+        </w:numPr>
+        <w:bidi w:val="0"/>
+        <w:ind w:right="0"/>
+        <w:jc w:val="left"/>
+        <w:rPr>
+          <w:rtl w:val="0"/>
+          <w:lang w:val="en-US"/>
+        </w:rPr>
+      </w:pPr>
+      <w:r>
+        <w:rPr>
+          <w:rtl w:val="0"/>
+          <w:lang w:val="en-US"/>
+        </w:rPr>
         <w:t>The notary will notarize both documents.</w:t>
       </w:r>
     </w:p>
@@ -671,7 +1022,7 @@
             <w14:miter w14:lim="400000"/>
           </w14:textOutline>
         </w:rPr>
-        <w:t xml:space="preserve">one </w:t>
+        <w:t>one document</w:t>
       </w:r>
       <w:r>
         <w:rPr>
@@ -684,7 +1035,7 @@
             <w14:miter w14:lim="400000"/>
           </w14:textOutline>
         </w:rPr>
-        <w:t>copy for yourself.</w:t>
+        <w:t xml:space="preserve"> for yourself.</w:t>
       </w:r>
     </w:p>
     <w:p>
@@ -728,14 +1079,28 @@
           <w:rtl w:val="0"/>
           <w:lang w:val="en-US"/>
         </w:rPr>
-        <w:t>}</w:t>
-      </w:r>
-      <w:r>
-        <w:rPr>
-          <w:rtl w:val="0"/>
-          <w:lang w:val="en-US"/>
-        </w:rPr>
-        <w:t xml:space="preserve"> a signed copy of the document.</w:t>
+        <w:t xml:space="preserve">} </w:t>
+      </w:r>
+      <w:r>
+        <w:rPr>
+          <w:rtl w:val="0"/>
+          <w:lang w:val="en-US"/>
+        </w:rPr>
+        <w:t>the</w:t>
+      </w:r>
+      <w:r>
+        <w:rPr>
+          <w:rtl w:val="0"/>
+          <w:lang w:val="en-US"/>
+        </w:rPr>
+        <w:t xml:space="preserve"> other signed and notarized</w:t>
+      </w:r>
+      <w:r>
+        <w:rPr>
+          <w:rtl w:val="0"/>
+          <w:lang w:val="en-US"/>
+        </w:rPr>
+        <w:t xml:space="preserve"> document.</w:t>
       </w:r>
     </w:p>
     <w:p>
@@ -764,7 +1129,21 @@
           <w:rtl w:val="0"/>
           <w:lang w:val="en-US"/>
         </w:rPr>
-        <w:t>After that, {{ caregivers[0].name.full() }} can show this document to prove they have permission to make decisions fo</w:t>
+        <w:t xml:space="preserve">After that, {{ caregivers[0].name.full() }} can show </w:t>
+      </w:r>
+      <w:r>
+        <w:rPr>
+          <w:rtl w:val="0"/>
+          <w:lang w:val="en-US"/>
+        </w:rPr>
+        <w:t>their</w:t>
+      </w:r>
+      <w:r>
+        <w:rPr>
+          <w:rtl w:val="0"/>
+          <w:lang w:val="en-US"/>
+        </w:rPr>
+        <w:t xml:space="preserve"> document to prove they have permission to make decisions fo</w:t>
       </w:r>
       <w:r>
         <w:rPr>

</xml_diff>